<commit_message>
feat: add some test
</commit_message>
<xml_diff>
--- a/buoi-4/22653991_Trần Tiến_B4.docx
+++ b/buoi-4/22653991_Trần Tiến_B4.docx
@@ -527,6 +527,7 @@
       </w:pPr>
       <w:r>
         <w:rPr>
+          <w:noProof/>
           <w:lang w:val="vi-VN"/>
         </w:rPr>
         <w:drawing>
@@ -588,6 +589,7 @@
       </w:pPr>
       <w:r>
         <w:rPr>
+          <w:noProof/>
           <w:lang w:val="vi-VN"/>
         </w:rPr>
         <w:drawing>
@@ -665,6 +667,7 @@
       </w:pPr>
       <w:r>
         <w:rPr>
+          <w:noProof/>
           <w:lang w:val="vi-VN"/>
         </w:rPr>
         <w:drawing>
@@ -723,6 +726,7 @@
       </w:pPr>
       <w:r>
         <w:rPr>
+          <w:noProof/>
           <w:lang w:val="vi-VN"/>
         </w:rPr>
         <w:drawing>
@@ -2046,16 +2050,7 @@
           <w:bCs/>
           <w:lang w:val="vi-VN"/>
         </w:rPr>
-        <w:t>X</w:t>
-      </w:r>
-      <w:r>
-        <w:rPr>
-          <w:rFonts w:ascii="Times New Roman" w:hAnsi="Times New Roman" w:cs="Times New Roman"/>
-          <w:b/>
-          <w:bCs/>
-          <w:lang w:val="vi-VN"/>
-        </w:rPr>
-        <w:t>ác định tham số đầu vào, đầu ra trong việc thiết kế FIR</w:t>
+        <w:t>Xác định tham số đầu vào, đầu ra trong việc thiết kế FIR</w:t>
       </w:r>
     </w:p>
     <w:p>
@@ -2167,7 +2162,6 @@
                 <w:rFonts w:ascii="Times New Roman" w:hAnsi="Times New Roman" w:cs="Times New Roman"/>
                 <w:b/>
                 <w:bCs/>
-                <w:lang/>
               </w:rPr>
             </w:pPr>
             <w:r>
@@ -2175,7 +2169,6 @@
                 <w:rFonts w:ascii="Times New Roman" w:hAnsi="Times New Roman" w:cs="Times New Roman"/>
                 <w:b/>
                 <w:bCs/>
-                <w:lang/>
               </w:rPr>
               <w:t>Nhóm</w:t>
             </w:r>
@@ -2193,7 +2186,6 @@
                 <w:rFonts w:ascii="Times New Roman" w:hAnsi="Times New Roman" w:cs="Times New Roman"/>
                 <w:b/>
                 <w:bCs/>
-                <w:lang/>
               </w:rPr>
             </w:pPr>
             <w:r>
@@ -2201,7 +2193,6 @@
                 <w:rFonts w:ascii="Times New Roman" w:hAnsi="Times New Roman" w:cs="Times New Roman"/>
                 <w:b/>
                 <w:bCs/>
-                <w:lang/>
               </w:rPr>
               <w:t>Tham số</w:t>
             </w:r>
@@ -2219,7 +2210,6 @@
                 <w:rFonts w:ascii="Times New Roman" w:hAnsi="Times New Roman" w:cs="Times New Roman"/>
                 <w:b/>
                 <w:bCs/>
-                <w:lang/>
               </w:rPr>
             </w:pPr>
             <w:r>
@@ -2227,7 +2217,6 @@
                 <w:rFonts w:ascii="Times New Roman" w:hAnsi="Times New Roman" w:cs="Times New Roman"/>
                 <w:b/>
                 <w:bCs/>
-                <w:lang/>
               </w:rPr>
               <w:t>Giá trị</w:t>
             </w:r>
@@ -2246,13 +2235,11 @@
               <w:spacing w:after="160"/>
               <w:rPr>
                 <w:rFonts w:ascii="Times New Roman" w:hAnsi="Times New Roman" w:cs="Times New Roman"/>
-                <w:lang/>
               </w:rPr>
             </w:pPr>
             <w:r>
               <w:rPr>
                 <w:rFonts w:ascii="Times New Roman" w:hAnsi="Times New Roman" w:cs="Times New Roman"/>
-                <w:lang/>
               </w:rPr>
               <w:t>Tần số</w:t>
             </w:r>
@@ -2317,13 +2304,11 @@
               <w:spacing w:after="160"/>
               <w:rPr>
                 <w:rFonts w:ascii="Times New Roman" w:hAnsi="Times New Roman" w:cs="Times New Roman"/>
-                <w:lang/>
               </w:rPr>
             </w:pPr>
             <w:r>
               <w:rPr>
                 <w:rFonts w:ascii="Times New Roman" w:hAnsi="Times New Roman" w:cs="Times New Roman"/>
-                <w:lang/>
               </w:rPr>
               <w:t>0.3π</w:t>
             </w:r>
@@ -2342,7 +2327,6 @@
               <w:spacing w:after="160"/>
               <w:rPr>
                 <w:rFonts w:ascii="Times New Roman" w:hAnsi="Times New Roman" w:cs="Times New Roman"/>
-                <w:lang/>
               </w:rPr>
             </w:pPr>
           </w:p>
@@ -2359,7 +2343,6 @@
               <w:jc w:val="center"/>
               <w:rPr>
                 <w:rFonts w:ascii="Times New Roman" w:hAnsi="Times New Roman" w:cs="Times New Roman"/>
-                <w:lang/>
               </w:rPr>
             </w:pPr>
             <m:oMathPara>
@@ -2405,13 +2388,11 @@
               <w:spacing w:after="160"/>
               <w:rPr>
                 <w:rFonts w:ascii="Times New Roman" w:hAnsi="Times New Roman" w:cs="Times New Roman"/>
-                <w:lang/>
               </w:rPr>
             </w:pPr>
             <w:r>
               <w:rPr>
                 <w:rFonts w:ascii="Times New Roman" w:hAnsi="Times New Roman" w:cs="Times New Roman"/>
-                <w:lang/>
               </w:rPr>
               <w:t>0.4π</w:t>
             </w:r>
@@ -2430,7 +2411,6 @@
               <w:spacing w:after="160"/>
               <w:rPr>
                 <w:rFonts w:ascii="Times New Roman" w:hAnsi="Times New Roman" w:cs="Times New Roman"/>
-                <w:lang/>
               </w:rPr>
             </w:pPr>
           </w:p>
@@ -2493,13 +2473,11 @@
               <w:spacing w:after="160"/>
               <w:rPr>
                 <w:rFonts w:ascii="Times New Roman" w:hAnsi="Times New Roman" w:cs="Times New Roman"/>
-                <w:lang/>
               </w:rPr>
             </w:pPr>
             <w:r>
               <w:rPr>
                 <w:rFonts w:ascii="Times New Roman" w:hAnsi="Times New Roman" w:cs="Times New Roman"/>
-                <w:lang/>
               </w:rPr>
               <w:t>0.</w:t>
             </w:r>
@@ -2513,7 +2491,6 @@
             <w:r>
               <w:rPr>
                 <w:rFonts w:ascii="Times New Roman" w:hAnsi="Times New Roman" w:cs="Times New Roman"/>
-                <w:lang/>
               </w:rPr>
               <w:t>π</w:t>
             </w:r>
@@ -2532,7 +2509,6 @@
               <w:spacing w:after="160"/>
               <w:rPr>
                 <w:rFonts w:ascii="Times New Roman" w:hAnsi="Times New Roman" w:cs="Times New Roman"/>
-                <w:lang/>
               </w:rPr>
             </w:pPr>
           </w:p>
@@ -2549,7 +2525,6 @@
               <w:jc w:val="center"/>
               <w:rPr>
                 <w:rFonts w:ascii="Times New Roman" w:hAnsi="Times New Roman" w:cs="Times New Roman"/>
-                <w:lang/>
               </w:rPr>
             </w:pPr>
             <m:oMathPara>
@@ -2594,13 +2569,11 @@
               <w:spacing w:after="160"/>
               <w:rPr>
                 <w:rFonts w:ascii="Times New Roman" w:hAnsi="Times New Roman" w:cs="Times New Roman"/>
-                <w:lang/>
               </w:rPr>
             </w:pPr>
             <w:r>
               <w:rPr>
                 <w:rFonts w:ascii="Times New Roman" w:hAnsi="Times New Roman" w:cs="Times New Roman"/>
-                <w:lang/>
               </w:rPr>
               <w:t>0.</w:t>
             </w:r>
@@ -2614,7 +2587,6 @@
             <w:r>
               <w:rPr>
                 <w:rFonts w:ascii="Times New Roman" w:hAnsi="Times New Roman" w:cs="Times New Roman"/>
-                <w:lang/>
               </w:rPr>
               <w:t>π</w:t>
             </w:r>
@@ -2633,13 +2605,11 @@
               <w:spacing w:after="160"/>
               <w:rPr>
                 <w:rFonts w:ascii="Times New Roman" w:hAnsi="Times New Roman" w:cs="Times New Roman"/>
-                <w:lang/>
               </w:rPr>
             </w:pPr>
             <w:r>
               <w:rPr>
                 <w:rFonts w:ascii="Times New Roman" w:hAnsi="Times New Roman" w:cs="Times New Roman"/>
-                <w:lang/>
               </w:rPr>
               <w:t>Đặc tính biên độ</w:t>
             </w:r>
@@ -2704,13 +2674,11 @@
               <w:spacing w:after="160"/>
               <w:rPr>
                 <w:rFonts w:ascii="Times New Roman" w:hAnsi="Times New Roman" w:cs="Times New Roman"/>
-                <w:lang/>
               </w:rPr>
             </w:pPr>
             <w:r>
               <w:rPr>
                 <w:rFonts w:ascii="Times New Roman" w:hAnsi="Times New Roman" w:cs="Times New Roman"/>
-                <w:lang/>
               </w:rPr>
               <w:t>40 dB</w:t>
             </w:r>
@@ -2729,7 +2697,6 @@
               <w:spacing w:after="160"/>
               <w:rPr>
                 <w:rFonts w:ascii="Times New Roman" w:hAnsi="Times New Roman" w:cs="Times New Roman"/>
-                <w:lang/>
               </w:rPr>
             </w:pPr>
           </w:p>
@@ -2793,13 +2760,11 @@
               <w:spacing w:after="160"/>
               <w:rPr>
                 <w:rFonts w:ascii="Times New Roman" w:hAnsi="Times New Roman" w:cs="Times New Roman"/>
-                <w:lang/>
               </w:rPr>
             </w:pPr>
             <w:r>
               <w:rPr>
                 <w:rFonts w:ascii="Times New Roman" w:hAnsi="Times New Roman" w:cs="Times New Roman"/>
-                <w:lang/>
               </w:rPr>
               <w:t>0.5 dB</w:t>
             </w:r>
@@ -2862,7 +2827,6 @@
             <w:pPr>
               <w:rPr>
                 <w:rFonts w:ascii="Times New Roman" w:hAnsi="Times New Roman" w:cs="Times New Roman"/>
-                <w:lang/>
               </w:rPr>
             </w:pPr>
             <w:r>
@@ -3283,6 +3247,7 @@
       </w:pPr>
       <w:r>
         <w:rPr>
+          <w:noProof/>
           <w:lang w:val="vi-VN"/>
         </w:rPr>
         <w:drawing>
@@ -3795,7 +3760,7 @@
                 <w:noProof/>
               </w:rPr>
               <w:drawing>
-                <wp:inline distT="0" distB="0" distL="0" distR="0" wp14:anchorId="6EB32B61" wp14:editId="6A9411F6">
+                <wp:inline distT="0" distB="0" distL="0" distR="0" wp14:anchorId="6EB32B61" wp14:editId="1E2662DA">
                   <wp:extent cx="1800225" cy="1350168"/>
                   <wp:effectExtent l="0" t="0" r="0" b="2540"/>
                   <wp:docPr id="776614474" name="Picture 10"/>
@@ -3855,7 +3820,7 @@
                 <w:noProof/>
               </w:rPr>
               <w:drawing>
-                <wp:inline distT="0" distB="0" distL="0" distR="0" wp14:anchorId="41D6FCE7" wp14:editId="6FB104CE">
+                <wp:inline distT="0" distB="0" distL="0" distR="0" wp14:anchorId="41D6FCE7" wp14:editId="0262AA28">
                   <wp:extent cx="1800225" cy="1350170"/>
                   <wp:effectExtent l="0" t="0" r="0" b="2540"/>
                   <wp:docPr id="1067516179" name="Picture 11"/>
@@ -3915,7 +3880,7 @@
                 <w:noProof/>
               </w:rPr>
               <w:drawing>
-                <wp:inline distT="0" distB="0" distL="0" distR="0" wp14:anchorId="66E656C1" wp14:editId="2D9B2778">
+                <wp:inline distT="0" distB="0" distL="0" distR="0" wp14:anchorId="66E656C1" wp14:editId="049C7C8C">
                   <wp:extent cx="1800013" cy="1350010"/>
                   <wp:effectExtent l="0" t="0" r="0" b="2540"/>
                   <wp:docPr id="668614714" name="Picture 12"/>
@@ -4023,13 +3988,11 @@
         <w:jc w:val="both"/>
         <w:rPr>
           <w:rFonts w:ascii="Times New Roman" w:hAnsi="Times New Roman" w:cs="Times New Roman"/>
-          <w:lang/>
-        </w:rPr>
-      </w:pPr>
-      <w:r>
-        <w:rPr>
-          <w:rFonts w:ascii="Times New Roman" w:hAnsi="Times New Roman" w:cs="Times New Roman"/>
-          <w:lang/>
+        </w:rPr>
+      </w:pPr>
+      <w:r>
+        <w:rPr>
+          <w:rFonts w:ascii="Times New Roman" w:hAnsi="Times New Roman" w:cs="Times New Roman"/>
         </w:rPr>
         <w:t>1. Khi bậc bộ lọc M nhỏ</w:t>
       </w:r>
@@ -4044,13 +4007,11 @@
         <w:jc w:val="both"/>
         <w:rPr>
           <w:rFonts w:ascii="Times New Roman" w:hAnsi="Times New Roman" w:cs="Times New Roman"/>
-          <w:lang/>
-        </w:rPr>
-      </w:pPr>
-      <w:r>
-        <w:rPr>
-          <w:rFonts w:ascii="Times New Roman" w:hAnsi="Times New Roman" w:cs="Times New Roman"/>
-          <w:lang/>
+        </w:rPr>
+      </w:pPr>
+      <w:r>
+        <w:rPr>
+          <w:rFonts w:ascii="Times New Roman" w:hAnsi="Times New Roman" w:cs="Times New Roman"/>
         </w:rPr>
         <w:t>Đáp ứng biên độ chưa sắc, vùng chuyển tiếp rộng</w:t>
       </w:r>
@@ -4065,13 +4026,11 @@
         <w:jc w:val="both"/>
         <w:rPr>
           <w:rFonts w:ascii="Times New Roman" w:hAnsi="Times New Roman" w:cs="Times New Roman"/>
-          <w:lang/>
-        </w:rPr>
-      </w:pPr>
-      <w:r>
-        <w:rPr>
-          <w:rFonts w:ascii="Times New Roman" w:hAnsi="Times New Roman" w:cs="Times New Roman"/>
-          <w:lang/>
+        </w:rPr>
+      </w:pPr>
+      <w:r>
+        <w:rPr>
+          <w:rFonts w:ascii="Times New Roman" w:hAnsi="Times New Roman" w:cs="Times New Roman"/>
         </w:rPr>
         <w:t>Suy hao dải dừng As nhỏ, không đạt yêu cầu thiết kế</w:t>
       </w:r>
@@ -4086,13 +4045,11 @@
         <w:jc w:val="both"/>
         <w:rPr>
           <w:rFonts w:ascii="Times New Roman" w:hAnsi="Times New Roman" w:cs="Times New Roman"/>
-          <w:lang/>
-        </w:rPr>
-      </w:pPr>
-      <w:r>
-        <w:rPr>
-          <w:rFonts w:ascii="Times New Roman" w:hAnsi="Times New Roman" w:cs="Times New Roman"/>
-          <w:lang/>
+        </w:rPr>
+      </w:pPr>
+      <w:r>
+        <w:rPr>
+          <w:rFonts w:ascii="Times New Roman" w:hAnsi="Times New Roman" w:cs="Times New Roman"/>
         </w:rPr>
         <w:t>Gợn dải thông Rp lớn, biên độ trong dải thông dao động nhiều</w:t>
       </w:r>
@@ -4107,13 +4064,11 @@
         <w:jc w:val="both"/>
         <w:rPr>
           <w:rFonts w:ascii="Times New Roman" w:hAnsi="Times New Roman" w:cs="Times New Roman"/>
-          <w:lang/>
-        </w:rPr>
-      </w:pPr>
-      <w:r>
-        <w:rPr>
-          <w:rFonts w:ascii="Times New Roman" w:hAnsi="Times New Roman" w:cs="Times New Roman"/>
-          <w:lang/>
+        </w:rPr>
+      </w:pPr>
+      <w:r>
+        <w:rPr>
+          <w:rFonts w:ascii="Times New Roman" w:hAnsi="Times New Roman" w:cs="Times New Roman"/>
         </w:rPr>
         <w:t>Đáp ứng tần số xa so với lý tưởng</w:t>
       </w:r>
@@ -4125,13 +4080,11 @@
         <w:jc w:val="both"/>
         <w:rPr>
           <w:rFonts w:ascii="Times New Roman" w:hAnsi="Times New Roman" w:cs="Times New Roman"/>
-          <w:lang/>
-        </w:rPr>
-      </w:pPr>
-      <w:r>
-        <w:rPr>
-          <w:rFonts w:ascii="Times New Roman" w:hAnsi="Times New Roman" w:cs="Times New Roman"/>
-          <w:lang/>
+        </w:rPr>
+      </w:pPr>
+      <w:r>
+        <w:rPr>
+          <w:rFonts w:ascii="Times New Roman" w:hAnsi="Times New Roman" w:cs="Times New Roman"/>
         </w:rPr>
         <w:t>2. Khi tăng bậc bộ lọc M</w:t>
       </w:r>
@@ -4146,13 +4099,11 @@
         <w:jc w:val="both"/>
         <w:rPr>
           <w:rFonts w:ascii="Times New Roman" w:hAnsi="Times New Roman" w:cs="Times New Roman"/>
-          <w:lang/>
-        </w:rPr>
-      </w:pPr>
-      <w:r>
-        <w:rPr>
-          <w:rFonts w:ascii="Times New Roman" w:hAnsi="Times New Roman" w:cs="Times New Roman"/>
-          <w:lang/>
+        </w:rPr>
+      </w:pPr>
+      <w:r>
+        <w:rPr>
+          <w:rFonts w:ascii="Times New Roman" w:hAnsi="Times New Roman" w:cs="Times New Roman"/>
         </w:rPr>
         <w:t>Vùng chuyển tiếp hẹp hơn, biên lọc sắc hơn</w:t>
       </w:r>
@@ -4167,13 +4118,11 @@
         <w:jc w:val="both"/>
         <w:rPr>
           <w:rFonts w:ascii="Times New Roman" w:hAnsi="Times New Roman" w:cs="Times New Roman"/>
-          <w:lang/>
-        </w:rPr>
-      </w:pPr>
-      <w:r>
-        <w:rPr>
-          <w:rFonts w:ascii="Times New Roman" w:hAnsi="Times New Roman" w:cs="Times New Roman"/>
-          <w:lang/>
+        </w:rPr>
+      </w:pPr>
+      <w:r>
+        <w:rPr>
+          <w:rFonts w:ascii="Times New Roman" w:hAnsi="Times New Roman" w:cs="Times New Roman"/>
         </w:rPr>
         <w:t>Suy hao dải dừng As tăng, tiệm cận hoặc đạt giá trị thiết kế</w:t>
       </w:r>
@@ -4188,13 +4137,11 @@
         <w:jc w:val="both"/>
         <w:rPr>
           <w:rFonts w:ascii="Times New Roman" w:hAnsi="Times New Roman" w:cs="Times New Roman"/>
-          <w:lang/>
-        </w:rPr>
-      </w:pPr>
-      <w:r>
-        <w:rPr>
-          <w:rFonts w:ascii="Times New Roman" w:hAnsi="Times New Roman" w:cs="Times New Roman"/>
-          <w:lang/>
+        </w:rPr>
+      </w:pPr>
+      <w:r>
+        <w:rPr>
+          <w:rFonts w:ascii="Times New Roman" w:hAnsi="Times New Roman" w:cs="Times New Roman"/>
         </w:rPr>
         <w:t>Gợn dải thông Rp giảm, đáp ứng trong dải thông phẳng hơn</w:t>
       </w:r>
@@ -4209,13 +4156,11 @@
         <w:jc w:val="both"/>
         <w:rPr>
           <w:rFonts w:ascii="Times New Roman" w:hAnsi="Times New Roman" w:cs="Times New Roman"/>
-          <w:lang/>
-        </w:rPr>
-      </w:pPr>
-      <w:r>
-        <w:rPr>
-          <w:rFonts w:ascii="Times New Roman" w:hAnsi="Times New Roman" w:cs="Times New Roman"/>
-          <w:lang/>
+        </w:rPr>
+      </w:pPr>
+      <w:r>
+        <w:rPr>
+          <w:rFonts w:ascii="Times New Roman" w:hAnsi="Times New Roman" w:cs="Times New Roman"/>
         </w:rPr>
         <w:t>Đáp ứng tần số gần với bộ lọc lý tưởng</w:t>
       </w:r>
@@ -4227,13 +4172,11 @@
         <w:jc w:val="both"/>
         <w:rPr>
           <w:rFonts w:ascii="Times New Roman" w:hAnsi="Times New Roman" w:cs="Times New Roman"/>
-          <w:lang/>
-        </w:rPr>
-      </w:pPr>
-      <w:r>
-        <w:rPr>
-          <w:rFonts w:ascii="Times New Roman" w:hAnsi="Times New Roman" w:cs="Times New Roman"/>
-          <w:lang/>
+        </w:rPr>
+      </w:pPr>
+      <w:r>
+        <w:rPr>
+          <w:rFonts w:ascii="Times New Roman" w:hAnsi="Times New Roman" w:cs="Times New Roman"/>
         </w:rPr>
         <w:t>3. Khi bậc bộ lọc M rất lớn</w:t>
       </w:r>
@@ -4248,13 +4191,11 @@
         <w:jc w:val="both"/>
         <w:rPr>
           <w:rFonts w:ascii="Times New Roman" w:hAnsi="Times New Roman" w:cs="Times New Roman"/>
-          <w:lang/>
-        </w:rPr>
-      </w:pPr>
-      <w:r>
-        <w:rPr>
-          <w:rFonts w:ascii="Times New Roman" w:hAnsi="Times New Roman" w:cs="Times New Roman"/>
-          <w:lang/>
+        </w:rPr>
+      </w:pPr>
+      <w:r>
+        <w:rPr>
+          <w:rFonts w:ascii="Times New Roman" w:hAnsi="Times New Roman" w:cs="Times New Roman"/>
         </w:rPr>
         <w:t>Đáp ứng biên độ rất sắc</w:t>
       </w:r>
@@ -4269,13 +4210,11 @@
         <w:jc w:val="both"/>
         <w:rPr>
           <w:rFonts w:ascii="Times New Roman" w:hAnsi="Times New Roman" w:cs="Times New Roman"/>
-          <w:lang/>
-        </w:rPr>
-      </w:pPr>
-      <w:r>
-        <w:rPr>
-          <w:rFonts w:ascii="Times New Roman" w:hAnsi="Times New Roman" w:cs="Times New Roman"/>
-          <w:lang/>
+        </w:rPr>
+      </w:pPr>
+      <w:r>
+        <w:rPr>
+          <w:rFonts w:ascii="Times New Roman" w:hAnsi="Times New Roman" w:cs="Times New Roman"/>
         </w:rPr>
         <w:t>As lớn hơn yêu cầu, dải dừng suy hao sâu</w:t>
       </w:r>
@@ -4290,13 +4229,11 @@
         <w:jc w:val="both"/>
         <w:rPr>
           <w:rFonts w:ascii="Times New Roman" w:hAnsi="Times New Roman" w:cs="Times New Roman"/>
-          <w:lang/>
-        </w:rPr>
-      </w:pPr>
-      <w:r>
-        <w:rPr>
-          <w:rFonts w:ascii="Times New Roman" w:hAnsi="Times New Roman" w:cs="Times New Roman"/>
-          <w:lang/>
+        </w:rPr>
+      </w:pPr>
+      <w:r>
+        <w:rPr>
+          <w:rFonts w:ascii="Times New Roman" w:hAnsi="Times New Roman" w:cs="Times New Roman"/>
         </w:rPr>
         <w:t>Rp rất nhỏ, dải thông gần như phẳng</w:t>
       </w:r>
@@ -4311,13 +4248,11 @@
         <w:jc w:val="both"/>
         <w:rPr>
           <w:rFonts w:ascii="Times New Roman" w:hAnsi="Times New Roman" w:cs="Times New Roman"/>
-          <w:lang/>
-        </w:rPr>
-      </w:pPr>
-      <w:r>
-        <w:rPr>
-          <w:rFonts w:ascii="Times New Roman" w:hAnsi="Times New Roman" w:cs="Times New Roman"/>
-          <w:lang/>
+        </w:rPr>
+      </w:pPr>
+      <w:r>
+        <w:rPr>
+          <w:rFonts w:ascii="Times New Roman" w:hAnsi="Times New Roman" w:cs="Times New Roman"/>
         </w:rPr>
         <w:t>Đổi lại, độ phức tạp tính toán tăng</w:t>
       </w:r>
@@ -4715,7 +4650,6 @@
           <w:rFonts w:ascii="Times New Roman" w:hAnsi="Times New Roman" w:cs="Times New Roman"/>
           <w:b/>
           <w:bCs/>
-          <w:lang/>
         </w:rPr>
       </w:pPr>
       <w:r>
@@ -4723,7 +4657,6 @@
           <w:rFonts w:ascii="Times New Roman" w:hAnsi="Times New Roman" w:cs="Times New Roman"/>
           <w:b/>
           <w:bCs/>
-          <w:lang/>
         </w:rPr>
         <w:t>1. Ảnh hưởng của việc thay đổi cửa sổ đến bậc lọc và đáp ứng tần số</w:t>
       </w:r>
@@ -4734,13 +4667,11 @@
         <w:jc w:val="both"/>
         <w:rPr>
           <w:rFonts w:ascii="Times New Roman" w:hAnsi="Times New Roman" w:cs="Times New Roman"/>
-          <w:lang/>
-        </w:rPr>
-      </w:pPr>
-      <w:r>
-        <w:rPr>
-          <w:rFonts w:ascii="Times New Roman" w:hAnsi="Times New Roman" w:cs="Times New Roman"/>
-          <w:lang/>
+        </w:rPr>
+      </w:pPr>
+      <w:r>
+        <w:rPr>
+          <w:rFonts w:ascii="Times New Roman" w:hAnsi="Times New Roman" w:cs="Times New Roman"/>
         </w:rPr>
         <w:t>Khi thiết kế bộ lọc FIR bằng phương pháp cửa sổ, loại cửa sổ quyết định trực tiếp đến mức suy hao dải dừng (As), độ gợn dải thông (Rp) và bậc lọc M cần thiết để thỏa mãn yêu cầu thiết kế.</w:t>
       </w:r>
@@ -4755,13 +4686,11 @@
         <w:jc w:val="both"/>
         <w:rPr>
           <w:rFonts w:ascii="Times New Roman" w:hAnsi="Times New Roman" w:cs="Times New Roman"/>
-          <w:lang/>
-        </w:rPr>
-      </w:pPr>
-      <w:r>
-        <w:rPr>
-          <w:rFonts w:ascii="Times New Roman" w:hAnsi="Times New Roman" w:cs="Times New Roman"/>
-          <w:lang/>
+        </w:rPr>
+      </w:pPr>
+      <w:r>
+        <w:rPr>
+          <w:rFonts w:ascii="Times New Roman" w:hAnsi="Times New Roman" w:cs="Times New Roman"/>
         </w:rPr>
         <w:t>Với các cửa sổ có suy hao dải dừng thấp (ví dụ cửa sổ chữ nhật), để đạt cùng As yêu cầu cần bậc lọc lớn, tuy nhiên đáp ứng vẫn có gợn lớn.</w:t>
       </w:r>
@@ -4776,13 +4705,11 @@
         <w:jc w:val="both"/>
         <w:rPr>
           <w:rFonts w:ascii="Times New Roman" w:hAnsi="Times New Roman" w:cs="Times New Roman"/>
-          <w:lang/>
-        </w:rPr>
-      </w:pPr>
-      <w:r>
-        <w:rPr>
-          <w:rFonts w:ascii="Times New Roman" w:hAnsi="Times New Roman" w:cs="Times New Roman"/>
-          <w:lang/>
+        </w:rPr>
+      </w:pPr>
+      <w:r>
+        <w:rPr>
+          <w:rFonts w:ascii="Times New Roman" w:hAnsi="Times New Roman" w:cs="Times New Roman"/>
         </w:rPr>
         <w:t>Với các cửa sổ có suy hao dải dừng cao (Hamming, Blackman), bộ lọc đạt As tốt hơn với bậc lọc nhỏ hơn, nhưng độ rộng chuyển tiếp tăng.</w:t>
       </w:r>
@@ -4797,13 +4724,11 @@
         <w:jc w:val="both"/>
         <w:rPr>
           <w:rFonts w:ascii="Times New Roman" w:hAnsi="Times New Roman" w:cs="Times New Roman"/>
-          <w:lang/>
-        </w:rPr>
-      </w:pPr>
-      <w:r>
-        <w:rPr>
-          <w:rFonts w:ascii="Times New Roman" w:hAnsi="Times New Roman" w:cs="Times New Roman"/>
-          <w:lang/>
+        </w:rPr>
+      </w:pPr>
+      <w:r>
+        <w:rPr>
+          <w:rFonts w:ascii="Times New Roman" w:hAnsi="Times New Roman" w:cs="Times New Roman"/>
         </w:rPr>
         <w:t>Cửa sổ Kaiser cho phép điều chỉnh tham số β, do đó có thể chủ động cân bằng giữa As, Rp và bậc lọc M.</w:t>
       </w:r>
@@ -4855,7 +4780,6 @@
                 <w:rFonts w:ascii="Times New Roman" w:hAnsi="Times New Roman" w:cs="Times New Roman"/>
                 <w:b/>
                 <w:bCs/>
-                <w:lang/>
               </w:rPr>
             </w:pPr>
             <w:r>
@@ -4863,7 +4787,6 @@
                 <w:rFonts w:ascii="Times New Roman" w:hAnsi="Times New Roman" w:cs="Times New Roman"/>
                 <w:b/>
                 <w:bCs/>
-                <w:lang/>
               </w:rPr>
               <w:t>Cửa sổ</w:t>
             </w:r>
@@ -4882,7 +4805,6 @@
                 <w:rFonts w:ascii="Times New Roman" w:hAnsi="Times New Roman" w:cs="Times New Roman"/>
                 <w:b/>
                 <w:bCs/>
-                <w:lang/>
               </w:rPr>
             </w:pPr>
             <w:r>
@@ -4890,7 +4812,6 @@
                 <w:rFonts w:ascii="Times New Roman" w:hAnsi="Times New Roman" w:cs="Times New Roman"/>
                 <w:b/>
                 <w:bCs/>
-                <w:lang/>
               </w:rPr>
               <w:t>As (xấp xỉ)</w:t>
             </w:r>
@@ -4909,7 +4830,6 @@
                 <w:rFonts w:ascii="Times New Roman" w:hAnsi="Times New Roman" w:cs="Times New Roman"/>
                 <w:b/>
                 <w:bCs/>
-                <w:lang/>
               </w:rPr>
             </w:pPr>
             <w:r>
@@ -4917,7 +4837,6 @@
                 <w:rFonts w:ascii="Times New Roman" w:hAnsi="Times New Roman" w:cs="Times New Roman"/>
                 <w:b/>
                 <w:bCs/>
-                <w:lang/>
               </w:rPr>
               <w:t>Bậc M</w:t>
             </w:r>
@@ -4936,7 +4855,6 @@
                 <w:rFonts w:ascii="Times New Roman" w:hAnsi="Times New Roman" w:cs="Times New Roman"/>
                 <w:b/>
                 <w:bCs/>
-                <w:lang/>
               </w:rPr>
             </w:pPr>
             <w:r>
@@ -4944,7 +4862,6 @@
                 <w:rFonts w:ascii="Times New Roman" w:hAnsi="Times New Roman" w:cs="Times New Roman"/>
                 <w:b/>
                 <w:bCs/>
-                <w:lang/>
               </w:rPr>
               <w:t>Độ rộng chuyển tiếp Δω</w:t>
             </w:r>
@@ -4963,7 +4880,6 @@
                 <w:rFonts w:ascii="Times New Roman" w:hAnsi="Times New Roman" w:cs="Times New Roman"/>
                 <w:b/>
                 <w:bCs/>
-                <w:lang/>
               </w:rPr>
             </w:pPr>
             <w:r>
@@ -4971,7 +4887,6 @@
                 <w:rFonts w:ascii="Times New Roman" w:hAnsi="Times New Roman" w:cs="Times New Roman"/>
                 <w:b/>
                 <w:bCs/>
-                <w:lang/>
               </w:rPr>
               <w:t>Nhận xét</w:t>
             </w:r>
@@ -4990,13 +4905,11 @@
               <w:jc w:val="both"/>
               <w:rPr>
                 <w:rFonts w:ascii="Times New Roman" w:hAnsi="Times New Roman" w:cs="Times New Roman"/>
-                <w:lang/>
               </w:rPr>
             </w:pPr>
             <w:r>
               <w:rPr>
                 <w:rFonts w:ascii="Times New Roman" w:hAnsi="Times New Roman" w:cs="Times New Roman"/>
-                <w:lang/>
               </w:rPr>
               <w:t>Hanning</w:t>
             </w:r>
@@ -5013,13 +4926,11 @@
               <w:jc w:val="both"/>
               <w:rPr>
                 <w:rFonts w:ascii="Times New Roman" w:hAnsi="Times New Roman" w:cs="Times New Roman"/>
-                <w:lang/>
               </w:rPr>
             </w:pPr>
             <w:r>
               <w:rPr>
                 <w:rFonts w:ascii="Times New Roman" w:hAnsi="Times New Roman" w:cs="Times New Roman"/>
-                <w:lang/>
               </w:rPr>
               <w:t>~31 dB</w:t>
             </w:r>
@@ -5036,13 +4947,11 @@
               <w:jc w:val="both"/>
               <w:rPr>
                 <w:rFonts w:ascii="Times New Roman" w:hAnsi="Times New Roman" w:cs="Times New Roman"/>
-                <w:lang/>
               </w:rPr>
             </w:pPr>
             <w:r>
               <w:rPr>
                 <w:rFonts w:ascii="Times New Roman" w:hAnsi="Times New Roman" w:cs="Times New Roman"/>
-                <w:lang/>
               </w:rPr>
               <w:t>Trung bình</w:t>
             </w:r>
@@ -5059,13 +4968,11 @@
               <w:jc w:val="both"/>
               <w:rPr>
                 <w:rFonts w:ascii="Times New Roman" w:hAnsi="Times New Roman" w:cs="Times New Roman"/>
-                <w:lang/>
               </w:rPr>
             </w:pPr>
             <w:r>
               <w:rPr>
                 <w:rFonts w:ascii="Times New Roman" w:hAnsi="Times New Roman" w:cs="Times New Roman"/>
-                <w:lang/>
               </w:rPr>
               <w:t>Trung bình</w:t>
             </w:r>
@@ -5082,13 +4989,11 @@
               <w:jc w:val="both"/>
               <w:rPr>
                 <w:rFonts w:ascii="Times New Roman" w:hAnsi="Times New Roman" w:cs="Times New Roman"/>
-                <w:lang/>
               </w:rPr>
             </w:pPr>
             <w:r>
               <w:rPr>
                 <w:rFonts w:ascii="Times New Roman" w:hAnsi="Times New Roman" w:cs="Times New Roman"/>
-                <w:lang/>
               </w:rPr>
               <w:t>Khá</w:t>
             </w:r>
@@ -5107,13 +5012,11 @@
               <w:jc w:val="both"/>
               <w:rPr>
                 <w:rFonts w:ascii="Times New Roman" w:hAnsi="Times New Roman" w:cs="Times New Roman"/>
-                <w:lang/>
               </w:rPr>
             </w:pPr>
             <w:r>
               <w:rPr>
                 <w:rFonts w:ascii="Times New Roman" w:hAnsi="Times New Roman" w:cs="Times New Roman"/>
-                <w:lang/>
               </w:rPr>
               <w:t>Hamming</w:t>
             </w:r>
@@ -5130,13 +5033,11 @@
               <w:jc w:val="both"/>
               <w:rPr>
                 <w:rFonts w:ascii="Times New Roman" w:hAnsi="Times New Roman" w:cs="Times New Roman"/>
-                <w:lang/>
               </w:rPr>
             </w:pPr>
             <w:r>
               <w:rPr>
                 <w:rFonts w:ascii="Times New Roman" w:hAnsi="Times New Roman" w:cs="Times New Roman"/>
-                <w:lang/>
               </w:rPr>
               <w:t>~40 dB</w:t>
             </w:r>
@@ -5153,13 +5054,11 @@
               <w:jc w:val="both"/>
               <w:rPr>
                 <w:rFonts w:ascii="Times New Roman" w:hAnsi="Times New Roman" w:cs="Times New Roman"/>
-                <w:lang/>
               </w:rPr>
             </w:pPr>
             <w:r>
               <w:rPr>
                 <w:rFonts w:ascii="Times New Roman" w:hAnsi="Times New Roman" w:cs="Times New Roman"/>
-                <w:lang/>
               </w:rPr>
               <w:t>Trung bình</w:t>
             </w:r>
@@ -5176,13 +5075,11 @@
               <w:jc w:val="both"/>
               <w:rPr>
                 <w:rFonts w:ascii="Times New Roman" w:hAnsi="Times New Roman" w:cs="Times New Roman"/>
-                <w:lang/>
               </w:rPr>
             </w:pPr>
             <w:r>
               <w:rPr>
                 <w:rFonts w:ascii="Times New Roman" w:hAnsi="Times New Roman" w:cs="Times New Roman"/>
-                <w:lang/>
               </w:rPr>
               <w:t>Rộng hơn</w:t>
             </w:r>
@@ -5199,13 +5096,11 @@
               <w:jc w:val="both"/>
               <w:rPr>
                 <w:rFonts w:ascii="Times New Roman" w:hAnsi="Times New Roman" w:cs="Times New Roman"/>
-                <w:lang/>
               </w:rPr>
             </w:pPr>
             <w:r>
               <w:rPr>
                 <w:rFonts w:ascii="Times New Roman" w:hAnsi="Times New Roman" w:cs="Times New Roman"/>
-                <w:lang/>
               </w:rPr>
               <w:t>Phù hợp</w:t>
             </w:r>
@@ -5224,13 +5119,11 @@
               <w:jc w:val="both"/>
               <w:rPr>
                 <w:rFonts w:ascii="Times New Roman" w:hAnsi="Times New Roman" w:cs="Times New Roman"/>
-                <w:lang/>
               </w:rPr>
             </w:pPr>
             <w:r>
               <w:rPr>
                 <w:rFonts w:ascii="Times New Roman" w:hAnsi="Times New Roman" w:cs="Times New Roman"/>
-                <w:lang/>
               </w:rPr>
               <w:t>Blackman</w:t>
             </w:r>
@@ -5247,13 +5140,11 @@
               <w:jc w:val="both"/>
               <w:rPr>
                 <w:rFonts w:ascii="Times New Roman" w:hAnsi="Times New Roman" w:cs="Times New Roman"/>
-                <w:lang/>
               </w:rPr>
             </w:pPr>
             <w:r>
               <w:rPr>
                 <w:rFonts w:ascii="Times New Roman" w:hAnsi="Times New Roman" w:cs="Times New Roman"/>
-                <w:lang/>
               </w:rPr>
               <w:t>~57 dB</w:t>
             </w:r>
@@ -5270,13 +5161,11 @@
               <w:jc w:val="both"/>
               <w:rPr>
                 <w:rFonts w:ascii="Times New Roman" w:hAnsi="Times New Roman" w:cs="Times New Roman"/>
-                <w:lang/>
               </w:rPr>
             </w:pPr>
             <w:r>
               <w:rPr>
                 <w:rFonts w:ascii="Times New Roman" w:hAnsi="Times New Roman" w:cs="Times New Roman"/>
-                <w:lang/>
               </w:rPr>
               <w:t>Lớn</w:t>
             </w:r>
@@ -5293,13 +5182,11 @@
               <w:jc w:val="both"/>
               <w:rPr>
                 <w:rFonts w:ascii="Times New Roman" w:hAnsi="Times New Roman" w:cs="Times New Roman"/>
-                <w:lang/>
               </w:rPr>
             </w:pPr>
             <w:r>
               <w:rPr>
                 <w:rFonts w:ascii="Times New Roman" w:hAnsi="Times New Roman" w:cs="Times New Roman"/>
-                <w:lang/>
               </w:rPr>
               <w:t>Rộng</w:t>
             </w:r>
@@ -5316,13 +5203,11 @@
               <w:jc w:val="both"/>
               <w:rPr>
                 <w:rFonts w:ascii="Times New Roman" w:hAnsi="Times New Roman" w:cs="Times New Roman"/>
-                <w:lang/>
               </w:rPr>
             </w:pPr>
             <w:r>
               <w:rPr>
                 <w:rFonts w:ascii="Times New Roman" w:hAnsi="Times New Roman" w:cs="Times New Roman"/>
-                <w:lang/>
               </w:rPr>
               <w:t>Suy hao tốt</w:t>
             </w:r>
@@ -5341,13 +5226,11 @@
               <w:jc w:val="both"/>
               <w:rPr>
                 <w:rFonts w:ascii="Times New Roman" w:hAnsi="Times New Roman" w:cs="Times New Roman"/>
-                <w:lang/>
               </w:rPr>
             </w:pPr>
             <w:r>
               <w:rPr>
                 <w:rFonts w:ascii="Times New Roman" w:hAnsi="Times New Roman" w:cs="Times New Roman"/>
-                <w:lang/>
               </w:rPr>
               <w:t>Kaiser</w:t>
             </w:r>
@@ -5364,13 +5247,11 @@
               <w:jc w:val="both"/>
               <w:rPr>
                 <w:rFonts w:ascii="Times New Roman" w:hAnsi="Times New Roman" w:cs="Times New Roman"/>
-                <w:lang/>
               </w:rPr>
             </w:pPr>
             <w:r>
               <w:rPr>
                 <w:rFonts w:ascii="Times New Roman" w:hAnsi="Times New Roman" w:cs="Times New Roman"/>
-                <w:lang/>
               </w:rPr>
               <w:t>Tùy β</w:t>
             </w:r>
@@ -5387,13 +5268,11 @@
               <w:jc w:val="both"/>
               <w:rPr>
                 <w:rFonts w:ascii="Times New Roman" w:hAnsi="Times New Roman" w:cs="Times New Roman"/>
-                <w:lang/>
               </w:rPr>
             </w:pPr>
             <w:r>
               <w:rPr>
                 <w:rFonts w:ascii="Times New Roman" w:hAnsi="Times New Roman" w:cs="Times New Roman"/>
-                <w:lang/>
               </w:rPr>
               <w:t>Tùy chỉnh</w:t>
             </w:r>
@@ -5410,13 +5289,11 @@
               <w:jc w:val="both"/>
               <w:rPr>
                 <w:rFonts w:ascii="Times New Roman" w:hAnsi="Times New Roman" w:cs="Times New Roman"/>
-                <w:lang/>
               </w:rPr>
             </w:pPr>
             <w:r>
               <w:rPr>
                 <w:rFonts w:ascii="Times New Roman" w:hAnsi="Times New Roman" w:cs="Times New Roman"/>
-                <w:lang/>
               </w:rPr>
               <w:t>Tùy chỉnh</w:t>
             </w:r>
@@ -5433,13 +5310,11 @@
               <w:jc w:val="both"/>
               <w:rPr>
                 <w:rFonts w:ascii="Times New Roman" w:hAnsi="Times New Roman" w:cs="Times New Roman"/>
-                <w:lang/>
               </w:rPr>
             </w:pPr>
             <w:r>
               <w:rPr>
                 <w:rFonts w:ascii="Times New Roman" w:hAnsi="Times New Roman" w:cs="Times New Roman"/>
-                <w:lang/>
               </w:rPr>
               <w:t>Linh hoạt</w:t>
             </w:r>
@@ -5465,7 +5340,6 @@
           <w:rFonts w:ascii="Times New Roman" w:hAnsi="Times New Roman" w:cs="Times New Roman"/>
           <w:b/>
           <w:bCs/>
-          <w:lang/>
         </w:rPr>
       </w:pPr>
       <w:r>
@@ -5473,7 +5347,6 @@
           <w:rFonts w:ascii="Times New Roman" w:hAnsi="Times New Roman" w:cs="Times New Roman"/>
           <w:b/>
           <w:bCs/>
-          <w:lang/>
         </w:rPr>
         <w:t>3. Tác dụng của cửa sổ</w:t>
       </w:r>
@@ -5487,13 +5360,11 @@
         <w:jc w:val="both"/>
         <w:rPr>
           <w:rFonts w:ascii="Times New Roman" w:hAnsi="Times New Roman" w:cs="Times New Roman"/>
-          <w:lang/>
-        </w:rPr>
-      </w:pPr>
-      <w:r>
-        <w:rPr>
-          <w:rFonts w:ascii="Times New Roman" w:hAnsi="Times New Roman" w:cs="Times New Roman"/>
-          <w:lang/>
+        </w:rPr>
+      </w:pPr>
+      <w:r>
+        <w:rPr>
+          <w:rFonts w:ascii="Times New Roman" w:hAnsi="Times New Roman" w:cs="Times New Roman"/>
         </w:rPr>
         <w:t>Giảm hiện tượng Gibbs do cắt ngắn đáp ứng xung lý tưởng</w:t>
       </w:r>
@@ -5507,13 +5378,11 @@
         <w:jc w:val="both"/>
         <w:rPr>
           <w:rFonts w:ascii="Times New Roman" w:hAnsi="Times New Roman" w:cs="Times New Roman"/>
-          <w:lang/>
-        </w:rPr>
-      </w:pPr>
-      <w:r>
-        <w:rPr>
-          <w:rFonts w:ascii="Times New Roman" w:hAnsi="Times New Roman" w:cs="Times New Roman"/>
-          <w:lang/>
+        </w:rPr>
+      </w:pPr>
+      <w:r>
+        <w:rPr>
+          <w:rFonts w:ascii="Times New Roman" w:hAnsi="Times New Roman" w:cs="Times New Roman"/>
         </w:rPr>
         <w:t>Kiểm soát gợn dải thông Rp</w:t>
       </w:r>
@@ -5527,13 +5396,11 @@
         <w:jc w:val="both"/>
         <w:rPr>
           <w:rFonts w:ascii="Times New Roman" w:hAnsi="Times New Roman" w:cs="Times New Roman"/>
-          <w:lang/>
-        </w:rPr>
-      </w:pPr>
-      <w:r>
-        <w:rPr>
-          <w:rFonts w:ascii="Times New Roman" w:hAnsi="Times New Roman" w:cs="Times New Roman"/>
-          <w:lang/>
+        </w:rPr>
+      </w:pPr>
+      <w:r>
+        <w:rPr>
+          <w:rFonts w:ascii="Times New Roman" w:hAnsi="Times New Roman" w:cs="Times New Roman"/>
         </w:rPr>
         <w:t>Quyết định mức suy hao dải dừng As</w:t>
       </w:r>
@@ -5547,13 +5414,11 @@
         <w:jc w:val="both"/>
         <w:rPr>
           <w:rFonts w:ascii="Times New Roman" w:hAnsi="Times New Roman" w:cs="Times New Roman"/>
-          <w:lang/>
-        </w:rPr>
-      </w:pPr>
-      <w:r>
-        <w:rPr>
-          <w:rFonts w:ascii="Times New Roman" w:hAnsi="Times New Roman" w:cs="Times New Roman"/>
-          <w:lang/>
+        </w:rPr>
+      </w:pPr>
+      <w:r>
+        <w:rPr>
+          <w:rFonts w:ascii="Times New Roman" w:hAnsi="Times New Roman" w:cs="Times New Roman"/>
         </w:rPr>
         <w:t>Ảnh hưởng trực tiếp đến độ rộng chuyển tiếp Δω</w:t>
       </w:r>
@@ -5565,7 +5430,6 @@
           <w:rFonts w:ascii="Times New Roman" w:hAnsi="Times New Roman" w:cs="Times New Roman"/>
           <w:b/>
           <w:bCs/>
-          <w:lang/>
         </w:rPr>
       </w:pPr>
       <w:r>
@@ -5573,7 +5437,6 @@
           <w:rFonts w:ascii="Times New Roman" w:hAnsi="Times New Roman" w:cs="Times New Roman"/>
           <w:b/>
           <w:bCs/>
-          <w:lang/>
         </w:rPr>
         <w:t>4. Mối quan hệ giữa Δω, M và As, Rp</w:t>
       </w:r>
@@ -5589,7 +5452,6 @@
       <w:r>
         <w:rPr>
           <w:rFonts w:ascii="Times New Roman" w:hAnsi="Times New Roman" w:cs="Times New Roman"/>
-          <w:lang/>
         </w:rPr>
         <w:t xml:space="preserve">Các đại lượng có mối quan hệ đánh </w:t>
       </w:r>
@@ -5606,7 +5468,6 @@
         <w:jc w:val="both"/>
         <w:rPr>
           <w:rFonts w:ascii="Times New Roman" w:hAnsi="Times New Roman" w:cs="Times New Roman"/>
-          <w:lang/>
         </w:rPr>
       </w:pPr>
       <m:oMathPara>
@@ -5616,7 +5477,6 @@
               <m:ctrlPr>
                 <w:rPr>
                   <w:rFonts w:ascii="Cambria Math" w:hAnsi="Cambria Math" w:cs="Times New Roman"/>
-                  <w:lang/>
                 </w:rPr>
               </m:ctrlPr>
             </m:borderBoxPr>
@@ -5635,7 +5495,6 @@
                   <m:ctrlPr>
                     <w:rPr>
                       <w:rFonts w:ascii="Cambria Math" w:hAnsi="Cambria Math" w:cs="Times New Roman"/>
-                      <w:lang/>
                     </w:rPr>
                   </m:ctrlPr>
                 </m:mPr>
@@ -5647,14 +5506,12 @@
                       </m:rPr>
                       <w:rPr>
                         <w:rFonts w:ascii="Cambria Math" w:hAnsi="Cambria Math" w:cs="Times New Roman"/>
-                        <w:lang/>
                       </w:rPr>
                       <m:t>Δ</m:t>
                     </m:r>
                     <m:r>
                       <w:rPr>
                         <w:rFonts w:ascii="Cambria Math" w:hAnsi="Cambria Math" w:cs="Times New Roman"/>
-                        <w:lang/>
                       </w:rPr>
                       <m:t>ω</m:t>
                     </m:r>
@@ -5663,7 +5520,6 @@
                     <m:r>
                       <w:rPr>
                         <w:rFonts w:ascii="Cambria Math" w:hAnsi="Cambria Math" w:cs="Times New Roman"/>
-                        <w:lang/>
                       </w:rPr>
                       <m:t>∝</m:t>
                     </m:r>
@@ -5672,7 +5528,6 @@
                         <m:ctrlPr>
                           <w:rPr>
                             <w:rFonts w:ascii="Cambria Math" w:hAnsi="Cambria Math" w:cs="Times New Roman"/>
-                            <w:lang/>
                           </w:rPr>
                         </m:ctrlPr>
                       </m:fPr>
@@ -5680,7 +5535,6 @@
                         <m:r>
                           <w:rPr>
                             <w:rFonts w:ascii="Cambria Math" w:hAnsi="Cambria Math" w:cs="Times New Roman"/>
-                            <w:lang/>
                           </w:rPr>
                           <m:t>1</m:t>
                         </m:r>
@@ -5689,7 +5543,6 @@
                         <m:r>
                           <w:rPr>
                             <w:rFonts w:ascii="Cambria Math" w:hAnsi="Cambria Math" w:cs="Times New Roman"/>
-                            <w:lang/>
                           </w:rPr>
                           <m:t>M</m:t>
                         </m:r>
@@ -5702,7 +5555,6 @@
                     <m:r>
                       <w:rPr>
                         <w:rFonts w:ascii="Cambria Math" w:hAnsi="Cambria Math" w:cs="Times New Roman"/>
-                        <w:lang/>
                       </w:rPr>
                       <m:t>As</m:t>
                     </m:r>
@@ -5711,7 +5563,6 @@
                     <m:r>
                       <w:rPr>
                         <w:rFonts w:ascii="Cambria Math" w:hAnsi="Cambria Math" w:cs="Times New Roman"/>
-                        <w:lang/>
                       </w:rPr>
                       <m:t>↑⇒M↑</m:t>
                     </m:r>
@@ -5722,7 +5573,6 @@
                     <m:r>
                       <w:rPr>
                         <w:rFonts w:ascii="Cambria Math" w:hAnsi="Cambria Math" w:cs="Times New Roman"/>
-                        <w:lang/>
                       </w:rPr>
                       <m:t>Rp</m:t>
                     </m:r>
@@ -5731,7 +5581,6 @@
                     <m:r>
                       <w:rPr>
                         <w:rFonts w:ascii="Cambria Math" w:hAnsi="Cambria Math" w:cs="Times New Roman"/>
-                        <w:lang/>
                       </w:rPr>
                       <m:t>↓⇒M↑</m:t>
                     </m:r>
@@ -5741,9 +5590,11 @@
             </m:e>
           </m:borderBox>
           <m:r>
+            <m:rPr>
+              <m:sty m:val="p"/>
+            </m:rPr>
             <w:rPr>
               <w:rFonts w:ascii="Times New Roman" w:hAnsi="Times New Roman" w:cs="Times New Roman"/>
-              <w:lang/>
             </w:rPr>
             <w:br/>
           </m:r>
@@ -5755,13 +5606,11 @@
         <w:jc w:val="both"/>
         <w:rPr>
           <w:rFonts w:ascii="Times New Roman" w:hAnsi="Times New Roman" w:cs="Times New Roman"/>
-          <w:lang/>
-        </w:rPr>
-      </w:pPr>
-      <w:r>
-        <w:rPr>
-          <w:rFonts w:ascii="Times New Roman" w:hAnsi="Times New Roman" w:cs="Times New Roman"/>
-          <w:lang/>
+        </w:rPr>
+      </w:pPr>
+      <w:r>
+        <w:rPr>
+          <w:rFonts w:ascii="Times New Roman" w:hAnsi="Times New Roman" w:cs="Times New Roman"/>
         </w:rPr>
         <w:t>Nghĩa là:</w:t>
       </w:r>
@@ -5775,13 +5624,11 @@
         <w:jc w:val="both"/>
         <w:rPr>
           <w:rFonts w:ascii="Times New Roman" w:hAnsi="Times New Roman" w:cs="Times New Roman"/>
-          <w:lang/>
-        </w:rPr>
-      </w:pPr>
-      <w:r>
-        <w:rPr>
-          <w:rFonts w:ascii="Times New Roman" w:hAnsi="Times New Roman" w:cs="Times New Roman"/>
-          <w:lang/>
+        </w:rPr>
+      </w:pPr>
+      <w:r>
+        <w:rPr>
+          <w:rFonts w:ascii="Times New Roman" w:hAnsi="Times New Roman" w:cs="Times New Roman"/>
         </w:rPr>
         <w:t>Muốn Δω nhỏ (biên lọc sắc) → M phải tăng</w:t>
       </w:r>
@@ -5795,13 +5642,11 @@
         <w:jc w:val="both"/>
         <w:rPr>
           <w:rFonts w:ascii="Times New Roman" w:hAnsi="Times New Roman" w:cs="Times New Roman"/>
-          <w:lang/>
-        </w:rPr>
-      </w:pPr>
-      <w:r>
-        <w:rPr>
-          <w:rFonts w:ascii="Times New Roman" w:hAnsi="Times New Roman" w:cs="Times New Roman"/>
-          <w:lang/>
+        </w:rPr>
+      </w:pPr>
+      <w:r>
+        <w:rPr>
+          <w:rFonts w:ascii="Times New Roman" w:hAnsi="Times New Roman" w:cs="Times New Roman"/>
         </w:rPr>
         <w:lastRenderedPageBreak/>
         <w:t>Muốn As lớn (dải dừng suy hao sâu) → M phải tăng hoặc chọn cửa sổ tốt hơn</w:t>
@@ -5816,13 +5661,11 @@
         <w:jc w:val="both"/>
         <w:rPr>
           <w:rFonts w:ascii="Times New Roman" w:hAnsi="Times New Roman" w:cs="Times New Roman"/>
-          <w:lang/>
-        </w:rPr>
-      </w:pPr>
-      <w:r>
-        <w:rPr>
-          <w:rFonts w:ascii="Times New Roman" w:hAnsi="Times New Roman" w:cs="Times New Roman"/>
-          <w:lang/>
+        </w:rPr>
+      </w:pPr>
+      <w:r>
+        <w:rPr>
+          <w:rFonts w:ascii="Times New Roman" w:hAnsi="Times New Roman" w:cs="Times New Roman"/>
         </w:rPr>
         <w:t>Muốn Rp nhỏ (dải thông phẳng) → M phải tăng</w:t>
       </w:r>
@@ -5834,7 +5677,6 @@
           <w:rFonts w:ascii="Times New Roman" w:hAnsi="Times New Roman" w:cs="Times New Roman"/>
           <w:b/>
           <w:bCs/>
-          <w:lang/>
         </w:rPr>
       </w:pPr>
       <w:r>
@@ -5849,7 +5691,6 @@
           <w:rFonts w:ascii="Times New Roman" w:hAnsi="Times New Roman" w:cs="Times New Roman"/>
           <w:b/>
           <w:bCs/>
-          <w:lang/>
         </w:rPr>
         <w:t>5. Kết luận</w:t>
       </w:r>
@@ -5859,13 +5700,11 @@
         <w:jc w:val="both"/>
         <w:rPr>
           <w:rFonts w:ascii="Times New Roman" w:hAnsi="Times New Roman" w:cs="Times New Roman"/>
-          <w:lang/>
-        </w:rPr>
-      </w:pPr>
-      <w:r>
-        <w:rPr>
-          <w:rFonts w:ascii="Times New Roman" w:hAnsi="Times New Roman" w:cs="Times New Roman"/>
-          <w:lang/>
+        </w:rPr>
+      </w:pPr>
+      <w:r>
+        <w:rPr>
+          <w:rFonts w:ascii="Times New Roman" w:hAnsi="Times New Roman" w:cs="Times New Roman"/>
         </w:rPr>
         <w:t>Việc lựa chọn cửa sổ thiết kế quyết định chất lượng đáp ứng tần số của bộ lọc FIR. Cửa sổ càng “tốt” thì suy hao dải dừng càng lớn và gợn dải thông càng nhỏ, nhưng đổi lại là độ rộng chuyển tiếp tăng hoặc bậc lọc phải lớn hơn. Do đó, cần lựa chọn cửa sổ và bậc lọc phù hợp để cân bằng giữa yêu cầu kỹ thuật và độ phức tạp tính toán.</w:t>
       </w:r>
@@ -8107,6 +7946,7 @@
   <w:style w:type="character" w:default="1" w:styleId="DefaultParagraphFont">
     <w:name w:val="Default Paragraph Font"/>
     <w:uiPriority w:val="1"/>
+    <w:semiHidden/>
     <w:unhideWhenUsed/>
   </w:style>
   <w:style w:type="table" w:default="1" w:styleId="TableNormal">

</xml_diff>